<commit_message>
Update the 3.0 manuals and split the survey into input and results appendices.
Co-authored-by: Cursor <cursoragent@cursor.com>
</commit_message>
<xml_diff>
--- a/docs/Уважаемые партнеры ООО НПК «ПромТехМастер» разработал инновационный продукт.docx
+++ b/docs/Уважаемые партнеры ООО НПК «ПромТехМастер» разработал инновационный продукт.docx
@@ -511,7 +511,7 @@
           <w:szCs w:val="23"/>
           <w:lang w:eastAsia="ru-RU"/>
         </w:rPr>
-        <w:t xml:space="preserve">Приложение 2: </w:t>
+        <w:t>Приложение 2. Опросный лист, исходные данные проекта ЭХЗ</w:t>
       </w:r>
       <w:r>
         <w:rPr>
@@ -521,7 +521,38 @@
           <w:szCs w:val="23"/>
           <w:lang w:eastAsia="ru-RU"/>
         </w:rPr>
-        <w:t>Опросный лист расчета ЭХЗ и анодных заземлителей ООО НПК "ПромТехМастер"</w:t>
+      </w:r>
+    </w:p>
+    <w:p>
+      <w:pPr>
+        <w:shd w:val="clear" w:color="auto" w:fill="FFFFFF"/>
+        <w:spacing w:line="300" w:lineRule="atLeast"/>
+        <w:rPr>
+          <w:rFonts w:ascii="Segoe UI" w:eastAsia="Times New Roman" w:hAnsi="Segoe UI" w:cs="Segoe UI"/>
+          <w:color w:val="333333"/>
+          <w:sz w:val="23"/>
+          <w:szCs w:val="23"/>
+          <w:lang w:eastAsia="ru-RU"/>
+        </w:rPr>
+      </w:pPr>
+      <w:r>
+        <w:rPr>
+          <w:rFonts w:ascii="Segoe UI" w:eastAsia="Times New Roman" w:hAnsi="Segoe UI" w:cs="Segoe UI"/>
+          <w:color w:val="333333"/>
+          <w:sz w:val="23"/>
+          <w:szCs w:val="23"/>
+          <w:lang w:eastAsia="ru-RU"/>
+        </w:rPr>
+        <w:t>Приложение 3. Результаты расчета анодных заземлителей ЭХЗ</w:t>
+      </w:r>
+      <w:r>
+        <w:rPr>
+          <w:rFonts w:ascii="Segoe UI" w:eastAsia="Times New Roman" w:hAnsi="Segoe UI" w:cs="Segoe UI"/>
+          <w:color w:val="333333"/>
+          <w:sz w:val="23"/>
+          <w:szCs w:val="23"/>
+          <w:lang w:eastAsia="ru-RU"/>
+        </w:rPr>
       </w:r>
     </w:p>
     <w:sectPr>

</xml_diff>